<commit_message>
docs: regenerate the deck and the business case build status
Ran with Word closed, so the generated section landed this time. Everything
above it in the business case is untouched.

Co-Authored-By: Claude Opus 5 (1M context) <noreply@anthropic.com>
Claude-Session: https://claude.ai/code/session_01BE9pUPtds3ZzUZiN8bmAhQ
</commit_message>
<xml_diff>
--- a/docs/Carnet-Business-Case.docx
+++ b/docs/Carnet-Business-Case.docx
@@ -11862,6 +11862,336 @@
           <w:sz w:val="21"/>
         </w:rPr>
         <w:t>+1 514 553 4360</w:t>
+      </w:r>
+    </w:p>
+    <w:p>
+      <w:pPr>
+        <w:pStyle w:val="Heading1"/>
+      </w:pPr>
+      <w:r>
+        <w:rPr>
+          <w:color w:val="1A4D52"/>
+        </w:rPr>
+        <w:t>13  Build status</w:t>
+      </w:r>
+    </w:p>
+    <w:p>
+      <w:pPr>
+        <w:spacing w:after="160"/>
+      </w:pPr>
+      <w:r>
+        <w:rPr>
+          <w:i/>
+          <w:color w:val="535E60"/>
+          <w:sz w:val="21"/>
+        </w:rPr>
+        <w:t>Counted from the repository on 10 September 2026. This section is generated by infra/scripts/update-business-case.py and rewritten each time the product changes. Everything above it is written by hand.</w:t>
+      </w:r>
+    </w:p>
+    <w:tbl>
+      <w:tblPr>
+        <w:tblStyle w:val="LightGrid-Accent1"/>
+        <w:tblW w:type="auto" w:w="0"/>
+        <w:tblLook w:firstColumn="1" w:firstRow="1" w:lastColumn="0" w:lastRow="0" w:noHBand="0" w:noVBand="1" w:val="04A0"/>
+      </w:tblPr>
+      <w:tblGrid>
+        <w:gridCol w:w="4759"/>
+        <w:gridCol w:w="4759"/>
+      </w:tblGrid>
+      <w:tr>
+        <w:tc>
+          <w:tcPr>
+            <w:tcW w:type="dxa" w:w="4759"/>
+          </w:tcPr>
+          <w:p>
+            <w:r>
+              <w:t>Measure</w:t>
+            </w:r>
+          </w:p>
+        </w:tc>
+        <w:tc>
+          <w:tcPr>
+            <w:tcW w:type="dxa" w:w="4759"/>
+          </w:tcPr>
+          <w:p>
+            <w:r>
+              <w:t>Now</w:t>
+            </w:r>
+          </w:p>
+        </w:tc>
+      </w:tr>
+      <w:tr>
+        <w:tc>
+          <w:tcPr>
+            <w:tcW w:type="dxa" w:w="4759"/>
+          </w:tcPr>
+          <w:p>
+            <w:r>
+              <w:t>Pages in the application</w:t>
+            </w:r>
+          </w:p>
+        </w:tc>
+        <w:tc>
+          <w:tcPr>
+            <w:tcW w:type="dxa" w:w="4759"/>
+          </w:tcPr>
+          <w:p>
+            <w:pPr>
+              <w:jc w:val="right"/>
+            </w:pPr>
+            <w:r>
+              <w:t>49</w:t>
+            </w:r>
+          </w:p>
+        </w:tc>
+      </w:tr>
+      <w:tr>
+        <w:tc>
+          <w:tcPr>
+            <w:tcW w:type="dxa" w:w="4759"/>
+          </w:tcPr>
+          <w:p>
+            <w:r>
+              <w:t>Database tables</w:t>
+            </w:r>
+          </w:p>
+        </w:tc>
+        <w:tc>
+          <w:tcPr>
+            <w:tcW w:type="dxa" w:w="4759"/>
+          </w:tcPr>
+          <w:p>
+            <w:pPr>
+              <w:jc w:val="right"/>
+            </w:pPr>
+            <w:r>
+              <w:t>99</w:t>
+            </w:r>
+          </w:p>
+        </w:tc>
+      </w:tr>
+      <w:tr>
+        <w:tc>
+          <w:tcPr>
+            <w:tcW w:type="dxa" w:w="4759"/>
+          </w:tcPr>
+          <w:p>
+            <w:r>
+              <w:t>Domain tests</w:t>
+            </w:r>
+          </w:p>
+        </w:tc>
+        <w:tc>
+          <w:tcPr>
+            <w:tcW w:type="dxa" w:w="4759"/>
+          </w:tcPr>
+          <w:p>
+            <w:pPr>
+              <w:jc w:val="right"/>
+            </w:pPr>
+            <w:r>
+              <w:t>708</w:t>
+            </w:r>
+          </w:p>
+        </w:tc>
+      </w:tr>
+      <w:tr>
+        <w:tc>
+          <w:tcPr>
+            <w:tcW w:type="dxa" w:w="4759"/>
+          </w:tcPr>
+          <w:p>
+            <w:r>
+              <w:t>Database invariant probes</w:t>
+            </w:r>
+          </w:p>
+        </w:tc>
+        <w:tc>
+          <w:tcPr>
+            <w:tcW w:type="dxa" w:w="4759"/>
+          </w:tcPr>
+          <w:p>
+            <w:pPr>
+              <w:jc w:val="right"/>
+            </w:pPr>
+            <w:r>
+              <w:t>11</w:t>
+            </w:r>
+          </w:p>
+        </w:tc>
+      </w:tr>
+      <w:tr>
+        <w:tc>
+          <w:tcPr>
+            <w:tcW w:type="dxa" w:w="4759"/>
+          </w:tcPr>
+          <w:p>
+            <w:r>
+              <w:t>Functional requirements</w:t>
+            </w:r>
+          </w:p>
+        </w:tc>
+        <w:tc>
+          <w:tcPr>
+            <w:tcW w:type="dxa" w:w="4759"/>
+          </w:tcPr>
+          <w:p>
+            <w:pPr>
+              <w:jc w:val="right"/>
+            </w:pPr>
+            <w:r>
+              <w:t>247</w:t>
+            </w:r>
+          </w:p>
+        </w:tc>
+      </w:tr>
+      <w:tr>
+        <w:tc>
+          <w:tcPr>
+            <w:tcW w:type="dxa" w:w="4759"/>
+          </w:tcPr>
+          <w:p>
+            <w:r>
+              <w:t>Capabilities built</w:t>
+            </w:r>
+          </w:p>
+        </w:tc>
+        <w:tc>
+          <w:tcPr>
+            <w:tcW w:type="dxa" w:w="4759"/>
+          </w:tcPr>
+          <w:p>
+            <w:pPr>
+              <w:jc w:val="right"/>
+            </w:pPr>
+            <w:r>
+              <w:t>42 of 83</w:t>
+            </w:r>
+          </w:p>
+        </w:tc>
+      </w:tr>
+      <w:tr>
+        <w:tc>
+          <w:tcPr>
+            <w:tcW w:type="dxa" w:w="4759"/>
+          </w:tcPr>
+          <w:p>
+            <w:r>
+              <w:t>Capabilities partial</w:t>
+            </w:r>
+          </w:p>
+        </w:tc>
+        <w:tc>
+          <w:tcPr>
+            <w:tcW w:type="dxa" w:w="4759"/>
+          </w:tcPr>
+          <w:p>
+            <w:pPr>
+              <w:jc w:val="right"/>
+            </w:pPr>
+            <w:r>
+              <w:t>10</w:t>
+            </w:r>
+          </w:p>
+        </w:tc>
+      </w:tr>
+      <w:tr>
+        <w:tc>
+          <w:tcPr>
+            <w:tcW w:type="dxa" w:w="4759"/>
+          </w:tcPr>
+          <w:p>
+            <w:r>
+              <w:t>Capabilities not yet built</w:t>
+            </w:r>
+          </w:p>
+        </w:tc>
+        <w:tc>
+          <w:tcPr>
+            <w:tcW w:type="dxa" w:w="4759"/>
+          </w:tcPr>
+          <w:p>
+            <w:pPr>
+              <w:jc w:val="right"/>
+            </w:pPr>
+            <w:r>
+              <w:t>31</w:t>
+            </w:r>
+          </w:p>
+        </w:tc>
+      </w:tr>
+    </w:tbl>
+    <w:p/>
+    <w:p>
+      <w:pPr>
+        <w:pStyle w:val="Heading3"/>
+      </w:pPr>
+      <w:r>
+        <w:rPr>
+          <w:color w:val="1A4D52"/>
+        </w:rPr>
+        <w:t>What is complete</w:t>
+      </w:r>
+    </w:p>
+    <w:p>
+      <w:pPr>
+        <w:spacing w:after="160"/>
+      </w:pPr>
+      <w:r>
+        <w:rPr>
+          <w:i w:val="0"/>
+          <w:color w:val="535E60"/>
+          <w:sz w:val="21"/>
+        </w:rPr>
+        <w:t>Jobs and the diary, customers and vehicles, the tamper-evident passport, estimates approved line by line, invoicing and payments, inventory with weighted average cost, purchasing with three-way match, a double-entry ledger posting from the work itself, bank reconciliation and period close, people with dated pay rates and productivity, multiple sites with stock transfers, counter sales, expenses, the automation engine, CRM with per-channel consent, the customer portal, and outbound messaging.</w:t>
+      </w:r>
+    </w:p>
+    <w:p>
+      <w:pPr>
+        <w:pStyle w:val="Heading3"/>
+      </w:pPr>
+      <w:r>
+        <w:rPr>
+          <w:color w:val="1A4D52"/>
+        </w:rPr>
+        <w:t>What is deliberately absent</w:t>
+      </w:r>
+    </w:p>
+    <w:p>
+      <w:pPr>
+        <w:spacing w:after="160"/>
+      </w:pPr>
+      <w:r>
+        <w:rPr>
+          <w:i w:val="0"/>
+          <w:color w:val="535E60"/>
+          <w:sz w:val="21"/>
+        </w:rPr>
+        <w:t>Card payment waits on a payment provider. Payroll export waits on a named target format. Parts fitment waits on a data source, because guessing it puts wrong parts on cars. Suggesting a diagnosis from symptoms waits on a corpus that does not exist yet, and a confident wrong suggestion on a braking fault is not a small error. Each of these is absent rather than approximated, on the grounds that a feature nobody can trust is worse than one that is honestly missing.</w:t>
+      </w:r>
+    </w:p>
+    <w:p>
+      <w:pPr>
+        <w:pStyle w:val="Heading3"/>
+      </w:pPr>
+      <w:r>
+        <w:rPr>
+          <w:color w:val="1A4D52"/>
+        </w:rPr>
+        <w:t>What is scheduled</w:t>
+      </w:r>
+    </w:p>
+    <w:p>
+      <w:pPr>
+        <w:spacing w:after="160"/>
+      </w:pPr>
+      <w:r>
+        <w:rPr>
+          <w:i w:val="0"/>
+          <w:color w:val="535E60"/>
+          <w:sz w:val="21"/>
+        </w:rPr>
+        <w:t>Phases 7 to 12, ordered by what a workshop loses each day without them. The digital vehicle inspection is first: six tables already exist and no interface does, and an inspection is what turns a booked oil change into approved brake work. Then the calendar and the bay board, then warranty and fleet, then reviews and loyalty and the inbound inbox, then the remaining accounting gaps, and last the owner command centre.</w:t>
       </w:r>
     </w:p>
     <w:sectPr>

</xml_diff>

<commit_message>
feat(ui): buttons that read as buttons, and a Pay button that says so
Every button now has a pointer, a semibold weight, a visible focus ring and
a one-pixel press; secondary sits raised with a shadow so it is not mistaken
for the input beside it; primary lifts on hover. The portal's Pay button is
the filled primary, full width, with a card icon and the amount inside it,
and the secure-checkout assurance beneath. Design system, design book and
architecture document regenerated.

Co-Authored-By: Claude Fable 5.1 <noreply@anthropic.com>
Claude-Session: https://claude.ai/code/session_01FFN282oc59bHdGPagxFXXK
</commit_message>
<xml_diff>
--- a/docs/Carnet-Business-Case.docx
+++ b/docs/Carnet-Business-Case.docx
@@ -2830,507 +2830,6 @@
         <w:t>WORKED EXAMPLE — A BRAKE REPAIR</w:t>
       </w:r>
     </w:p>
-    <w:tbl>
-      <w:tblPr>
-        <w:tblStyle w:val="TableGrid"/>
-        <w:tblW w:type="auto" w:w="0"/>
-        <w:jc w:val="left"/>
-        <w:tblLayout w:type="autofit"/>
-        <w:tblLook w:firstColumn="1" w:firstRow="1" w:lastColumn="0" w:lastRow="0" w:noHBand="0" w:noVBand="1" w:val="04A0"/>
-      </w:tblPr>
-      <w:tblGrid>
-        <w:gridCol w:w="2379"/>
-        <w:gridCol w:w="2379"/>
-        <w:gridCol w:w="2379"/>
-        <w:gridCol w:w="2379"/>
-      </w:tblGrid>
-      <w:tr>
-        <w:tc>
-          <w:tcPr>
-            <w:tcW w:type="dxa" w:w="3969"/>
-            <w:shd w:val="clear" w:fill="ECEFF0"/>
-          </w:tcPr>
-          <w:p>
-            <w:r/>
-            <w:r>
-              <w:rPr>
-                <w:rFonts w:ascii="Arial" w:hAnsi="Arial"/>
-                <w:b/>
-                <w:color w:val="0D3B3F"/>
-                <w:sz w:val="15"/>
-              </w:rPr>
-              <w:t>LINE</w:t>
-            </w:r>
-          </w:p>
-        </w:tc>
-        <w:tc>
-          <w:tcPr>
-            <w:tcW w:type="dxa" w:w="1701"/>
-            <w:shd w:val="clear" w:fill="ECEFF0"/>
-          </w:tcPr>
-          <w:p>
-            <w:r/>
-            <w:r>
-              <w:rPr>
-                <w:rFonts w:ascii="Arial" w:hAnsi="Arial"/>
-                <w:b/>
-                <w:color w:val="0D3B3F"/>
-                <w:sz w:val="15"/>
-              </w:rPr>
-              <w:t>CHARGED</w:t>
-            </w:r>
-          </w:p>
-        </w:tc>
-        <w:tc>
-          <w:tcPr>
-            <w:tcW w:type="dxa" w:w="1701"/>
-            <w:shd w:val="clear" w:fill="ECEFF0"/>
-          </w:tcPr>
-          <w:p>
-            <w:r/>
-            <w:r>
-              <w:rPr>
-                <w:rFonts w:ascii="Arial" w:hAnsi="Arial"/>
-                <w:b/>
-                <w:color w:val="0D3B3F"/>
-                <w:sz w:val="15"/>
-              </w:rPr>
-              <w:t>COST</w:t>
-            </w:r>
-          </w:p>
-        </w:tc>
-        <w:tc>
-          <w:tcPr>
-            <w:tcW w:type="dxa" w:w="1701"/>
-            <w:shd w:val="clear" w:fill="ECEFF0"/>
-          </w:tcPr>
-          <w:p>
-            <w:r/>
-            <w:r>
-              <w:rPr>
-                <w:rFonts w:ascii="Arial" w:hAnsi="Arial"/>
-                <w:b/>
-                <w:color w:val="0D3B3F"/>
-                <w:sz w:val="15"/>
-              </w:rPr>
-              <w:t>MARGIN</w:t>
-            </w:r>
-          </w:p>
-        </w:tc>
-      </w:tr>
-      <w:tr>
-        <w:tc>
-          <w:tcPr>
-            <w:tcW w:type="dxa" w:w="3969"/>
-          </w:tcPr>
-          <w:p>
-            <w:r/>
-            <w:r>
-              <w:rPr>
-                <w:rFonts w:ascii="Georgia" w:hAnsi="Georgia"/>
-                <w:color w:val="101718"/>
-                <w:sz w:val="18"/>
-              </w:rPr>
-              <w:t>Brake inspection, 1.0 h</w:t>
-            </w:r>
-          </w:p>
-        </w:tc>
-        <w:tc>
-          <w:tcPr>
-            <w:tcW w:type="dxa" w:w="1701"/>
-          </w:tcPr>
-          <w:p>
-            <w:r/>
-            <w:r>
-              <w:rPr>
-                <w:rFonts w:ascii="Georgia" w:hAnsi="Georgia"/>
-                <w:color w:val="101718"/>
-                <w:sz w:val="18"/>
-              </w:rPr>
-              <w:t>95.00</w:t>
-            </w:r>
-          </w:p>
-        </w:tc>
-        <w:tc>
-          <w:tcPr>
-            <w:tcW w:type="dxa" w:w="1701"/>
-          </w:tcPr>
-          <w:p>
-            <w:r/>
-            <w:r>
-              <w:rPr>
-                <w:rFonts w:ascii="Georgia" w:hAnsi="Georgia"/>
-                <w:color w:val="101718"/>
-                <w:sz w:val="18"/>
-              </w:rPr>
-              <w:t>38.00</w:t>
-            </w:r>
-          </w:p>
-        </w:tc>
-        <w:tc>
-          <w:tcPr>
-            <w:tcW w:type="dxa" w:w="1701"/>
-          </w:tcPr>
-          <w:p>
-            <w:r/>
-            <w:r>
-              <w:rPr>
-                <w:rFonts w:ascii="Georgia" w:hAnsi="Georgia"/>
-                <w:color w:val="101718"/>
-                <w:sz w:val="18"/>
-              </w:rPr>
-              <w:t>57.00</w:t>
-            </w:r>
-          </w:p>
-        </w:tc>
-      </w:tr>
-      <w:tr>
-        <w:tc>
-          <w:tcPr>
-            <w:tcW w:type="dxa" w:w="3969"/>
-          </w:tcPr>
-          <w:p>
-            <w:r/>
-            <w:r>
-              <w:rPr>
-                <w:rFonts w:ascii="Georgia" w:hAnsi="Georgia"/>
-                <w:color w:val="101718"/>
-                <w:sz w:val="18"/>
-              </w:rPr>
-              <w:t>Brake replacement, 3.5 h</w:t>
-            </w:r>
-          </w:p>
-        </w:tc>
-        <w:tc>
-          <w:tcPr>
-            <w:tcW w:type="dxa" w:w="1701"/>
-          </w:tcPr>
-          <w:p>
-            <w:r/>
-            <w:r>
-              <w:rPr>
-                <w:rFonts w:ascii="Georgia" w:hAnsi="Georgia"/>
-                <w:color w:val="101718"/>
-                <w:sz w:val="18"/>
-              </w:rPr>
-              <w:t>332.50</w:t>
-            </w:r>
-          </w:p>
-        </w:tc>
-        <w:tc>
-          <w:tcPr>
-            <w:tcW w:type="dxa" w:w="1701"/>
-          </w:tcPr>
-          <w:p>
-            <w:r/>
-            <w:r>
-              <w:rPr>
-                <w:rFonts w:ascii="Georgia" w:hAnsi="Georgia"/>
-                <w:color w:val="101718"/>
-                <w:sz w:val="18"/>
-              </w:rPr>
-              <w:t>133.00</w:t>
-            </w:r>
-          </w:p>
-        </w:tc>
-        <w:tc>
-          <w:tcPr>
-            <w:tcW w:type="dxa" w:w="1701"/>
-          </w:tcPr>
-          <w:p>
-            <w:r/>
-            <w:r>
-              <w:rPr>
-                <w:rFonts w:ascii="Georgia" w:hAnsi="Georgia"/>
-                <w:color w:val="101718"/>
-                <w:sz w:val="18"/>
-              </w:rPr>
-              <w:t>199.50</w:t>
-            </w:r>
-          </w:p>
-        </w:tc>
-      </w:tr>
-      <w:tr>
-        <w:tc>
-          <w:tcPr>
-            <w:tcW w:type="dxa" w:w="3969"/>
-          </w:tcPr>
-          <w:p>
-            <w:r/>
-            <w:r>
-              <w:rPr>
-                <w:rFonts w:ascii="Georgia" w:hAnsi="Georgia"/>
-                <w:color w:val="101718"/>
-                <w:sz w:val="18"/>
-              </w:rPr>
-              <w:t>Brake pads</w:t>
-            </w:r>
-          </w:p>
-        </w:tc>
-        <w:tc>
-          <w:tcPr>
-            <w:tcW w:type="dxa" w:w="1701"/>
-          </w:tcPr>
-          <w:p>
-            <w:r/>
-            <w:r>
-              <w:rPr>
-                <w:rFonts w:ascii="Georgia" w:hAnsi="Georgia"/>
-                <w:color w:val="101718"/>
-                <w:sz w:val="18"/>
-              </w:rPr>
-              <w:t>420.00</w:t>
-            </w:r>
-          </w:p>
-        </w:tc>
-        <w:tc>
-          <w:tcPr>
-            <w:tcW w:type="dxa" w:w="1701"/>
-          </w:tcPr>
-          <w:p>
-            <w:r/>
-            <w:r>
-              <w:rPr>
-                <w:rFonts w:ascii="Georgia" w:hAnsi="Georgia"/>
-                <w:color w:val="101718"/>
-                <w:sz w:val="18"/>
-              </w:rPr>
-              <w:t>252.00</w:t>
-            </w:r>
-          </w:p>
-        </w:tc>
-        <w:tc>
-          <w:tcPr>
-            <w:tcW w:type="dxa" w:w="1701"/>
-          </w:tcPr>
-          <w:p>
-            <w:r/>
-            <w:r>
-              <w:rPr>
-                <w:rFonts w:ascii="Georgia" w:hAnsi="Georgia"/>
-                <w:color w:val="101718"/>
-                <w:sz w:val="18"/>
-              </w:rPr>
-              <w:t>168.00</w:t>
-            </w:r>
-          </w:p>
-        </w:tc>
-      </w:tr>
-      <w:tr>
-        <w:tc>
-          <w:tcPr>
-            <w:tcW w:type="dxa" w:w="3969"/>
-          </w:tcPr>
-          <w:p>
-            <w:r/>
-            <w:r>
-              <w:rPr>
-                <w:rFonts w:ascii="Georgia" w:hAnsi="Georgia"/>
-                <w:color w:val="101718"/>
-                <w:sz w:val="18"/>
-              </w:rPr>
-              <w:t>Brake discs</w:t>
-            </w:r>
-          </w:p>
-        </w:tc>
-        <w:tc>
-          <w:tcPr>
-            <w:tcW w:type="dxa" w:w="1701"/>
-          </w:tcPr>
-          <w:p>
-            <w:r/>
-            <w:r>
-              <w:rPr>
-                <w:rFonts w:ascii="Georgia" w:hAnsi="Georgia"/>
-                <w:color w:val="101718"/>
-                <w:sz w:val="18"/>
-              </w:rPr>
-              <w:t>410.00</w:t>
-            </w:r>
-          </w:p>
-        </w:tc>
-        <w:tc>
-          <w:tcPr>
-            <w:tcW w:type="dxa" w:w="1701"/>
-          </w:tcPr>
-          <w:p>
-            <w:r/>
-            <w:r>
-              <w:rPr>
-                <w:rFonts w:ascii="Georgia" w:hAnsi="Georgia"/>
-                <w:color w:val="101718"/>
-                <w:sz w:val="18"/>
-              </w:rPr>
-              <w:t>246.00</w:t>
-            </w:r>
-          </w:p>
-        </w:tc>
-        <w:tc>
-          <w:tcPr>
-            <w:tcW w:type="dxa" w:w="1701"/>
-          </w:tcPr>
-          <w:p>
-            <w:r/>
-            <w:r>
-              <w:rPr>
-                <w:rFonts w:ascii="Georgia" w:hAnsi="Georgia"/>
-                <w:color w:val="101718"/>
-                <w:sz w:val="18"/>
-              </w:rPr>
-              <w:t>164.00</w:t>
-            </w:r>
-          </w:p>
-        </w:tc>
-      </w:tr>
-      <w:tr>
-        <w:tc>
-          <w:tcPr>
-            <w:tcW w:type="dxa" w:w="3969"/>
-            <w:shd w:val="clear" w:fill="E2ECEC"/>
-          </w:tcPr>
-          <w:p>
-            <w:r/>
-            <w:r>
-              <w:rPr>
-                <w:rFonts w:ascii="Georgia" w:hAnsi="Georgia"/>
-                <w:b/>
-                <w:color w:val="101718"/>
-                <w:sz w:val="18"/>
-              </w:rPr>
-              <w:t>Net, before tax</w:t>
-            </w:r>
-          </w:p>
-        </w:tc>
-        <w:tc>
-          <w:tcPr>
-            <w:tcW w:type="dxa" w:w="1701"/>
-            <w:shd w:val="clear" w:fill="E2ECEC"/>
-          </w:tcPr>
-          <w:p>
-            <w:r/>
-            <w:r>
-              <w:rPr>
-                <w:rFonts w:ascii="Georgia" w:hAnsi="Georgia"/>
-                <w:b w:val="0"/>
-                <w:color w:val="101718"/>
-                <w:sz w:val="18"/>
-              </w:rPr>
-              <w:t>1,257.50</w:t>
-            </w:r>
-          </w:p>
-        </w:tc>
-        <w:tc>
-          <w:tcPr>
-            <w:tcW w:type="dxa" w:w="1701"/>
-            <w:shd w:val="clear" w:fill="E2ECEC"/>
-          </w:tcPr>
-          <w:p>
-            <w:r/>
-            <w:r>
-              <w:rPr>
-                <w:rFonts w:ascii="Georgia" w:hAnsi="Georgia"/>
-                <w:b w:val="0"/>
-                <w:color w:val="101718"/>
-                <w:sz w:val="18"/>
-              </w:rPr>
-              <w:t>669.00</w:t>
-            </w:r>
-          </w:p>
-        </w:tc>
-        <w:tc>
-          <w:tcPr>
-            <w:tcW w:type="dxa" w:w="1701"/>
-            <w:shd w:val="clear" w:fill="E2ECEC"/>
-          </w:tcPr>
-          <w:p>
-            <w:r/>
-            <w:r>
-              <w:rPr>
-                <w:rFonts w:ascii="Georgia" w:hAnsi="Georgia"/>
-                <w:b w:val="0"/>
-                <w:color w:val="101718"/>
-                <w:sz w:val="18"/>
-              </w:rPr>
-              <w:t>588.50</w:t>
-            </w:r>
-          </w:p>
-        </w:tc>
-      </w:tr>
-      <w:tr>
-        <w:tc>
-          <w:tcPr>
-            <w:tcW w:type="dxa" w:w="3969"/>
-            <w:shd w:val="clear" w:fill="E2ECEC"/>
-          </w:tcPr>
-          <w:p>
-            <w:r/>
-            <w:r>
-              <w:rPr>
-                <w:rFonts w:ascii="Georgia" w:hAnsi="Georgia"/>
-                <w:b/>
-                <w:color w:val="101718"/>
-                <w:sz w:val="18"/>
-              </w:rPr>
-              <w:t>Gross margin</w:t>
-            </w:r>
-          </w:p>
-        </w:tc>
-        <w:tc>
-          <w:tcPr>
-            <w:tcW w:type="dxa" w:w="1701"/>
-            <w:shd w:val="clear" w:fill="E2ECEC"/>
-          </w:tcPr>
-          <w:p>
-            <w:r/>
-            <w:r>
-              <w:rPr>
-                <w:rFonts w:ascii="Georgia" w:hAnsi="Georgia"/>
-                <w:b w:val="0"/>
-                <w:color w:val="101718"/>
-                <w:sz w:val="18"/>
-              </w:rPr>
-              <w:t>—</w:t>
-            </w:r>
-          </w:p>
-        </w:tc>
-        <w:tc>
-          <w:tcPr>
-            <w:tcW w:type="dxa" w:w="1701"/>
-            <w:shd w:val="clear" w:fill="E2ECEC"/>
-          </w:tcPr>
-          <w:p>
-            <w:r/>
-            <w:r>
-              <w:rPr>
-                <w:rFonts w:ascii="Georgia" w:hAnsi="Georgia"/>
-                <w:b w:val="0"/>
-                <w:color w:val="101718"/>
-                <w:sz w:val="18"/>
-              </w:rPr>
-              <w:t>—</w:t>
-            </w:r>
-          </w:p>
-        </w:tc>
-        <w:tc>
-          <w:tcPr>
-            <w:tcW w:type="dxa" w:w="1701"/>
-            <w:shd w:val="clear" w:fill="E2ECEC"/>
-          </w:tcPr>
-          <w:p>
-            <w:r/>
-            <w:r>
-              <w:rPr>
-                <w:rFonts w:ascii="Georgia" w:hAnsi="Georgia"/>
-                <w:b w:val="0"/>
-                <w:color w:val="101718"/>
-                <w:sz w:val="18"/>
-              </w:rPr>
-              <w:t>46.8%</w:t>
-            </w:r>
-          </w:p>
-        </w:tc>
-      </w:tr>
-    </w:tbl>
     <w:p>
       <w:pPr>
         <w:spacing w:after="80"/>

</xml_diff>